<commit_message>
added placeholder of [kota_pilihan] on template surat penerimaan and surat keterangan selesai
</commit_message>
<xml_diff>
--- a/app/ThirdParty/surat-penerimaan/Surat Penerimaan Industry-Academia Collaboration Program.docx
+++ b/app/ThirdParty/surat-penerimaan/Surat Penerimaan Industry-Academia Collaboration Program.docx
@@ -1464,7 +1464,14 @@
           <w:rFonts w:ascii="Book Antiqua" w:eastAsia="Book Antiqua" w:hAnsi="Book Antiqua" w:cs="Book Antiqua"/>
           <w:color w:val="000000"/>
         </w:rPr>
-        <w:t xml:space="preserve">Semarang, </w:t>
+        <w:t>[kota_pilihan]</w:t>
+      </w:r>
+      <w:r>
+        <w:rPr>
+          <w:rFonts w:ascii="Book Antiqua" w:eastAsia="Book Antiqua" w:hAnsi="Book Antiqua" w:cs="Book Antiqua"/>
+          <w:color w:val="000000"/>
+        </w:rPr>
+        <w:t xml:space="preserve">, </w:t>
       </w:r>
       <w:r>
         <w:rPr>
@@ -1487,7 +1494,23 @@
           <w:rFonts w:ascii="Book Antiqua" w:eastAsia="Book Antiqua" w:hAnsi="Book Antiqua" w:cs="Book Antiqua"/>
           <w:color w:val="000000"/>
         </w:rPr>
-        <w:t xml:space="preserve"> penerbitan]</w:t>
+        <w:t xml:space="preserve"> </w:t>
+      </w:r>
+      <w:proofErr w:type="spellStart"/>
+      <w:r>
+        <w:rPr>
+          <w:rFonts w:ascii="Book Antiqua" w:eastAsia="Book Antiqua" w:hAnsi="Book Antiqua" w:cs="Book Antiqua"/>
+          <w:color w:val="000000"/>
+        </w:rPr>
+        <w:t>penerbitan</w:t>
+      </w:r>
+      <w:proofErr w:type="spellEnd"/>
+      <w:r>
+        <w:rPr>
+          <w:rFonts w:ascii="Book Antiqua" w:eastAsia="Book Antiqua" w:hAnsi="Book Antiqua" w:cs="Book Antiqua"/>
+          <w:color w:val="000000"/>
+        </w:rPr>
+        <w:t>]</w:t>
       </w:r>
     </w:p>
     <w:p>

</xml_diff>